<commit_message>
Milestone 1 - Project Foundation
</commit_message>
<xml_diff>
--- a/Walkthrough 17-07-2026 16h05.docx
+++ b/Walkthrough 17-07-2026 16h05.docx
@@ -682,6 +682,7 @@
                                       </w:rPr>
                                       <w:br/>
                                     </w:r>
+                                    <w:proofErr w:type="spellStart"/>
                                     <w:r>
                                       <w:rPr>
                                         <w:color w:val="595959" w:themeColor="text1" w:themeTint="A6"/>
@@ -690,6 +691,7 @@
                                       </w:rPr>
                                       <w:t>OpenPyXL</w:t>
                                     </w:r>
+                                    <w:proofErr w:type="spellEnd"/>
                                     <w:r>
                                       <w:rPr>
                                         <w:color w:val="595959" w:themeColor="text1" w:themeTint="A6"/>
@@ -746,6 +748,7 @@
                                       </w:rPr>
                                       <w:br/>
                                     </w:r>
+                                    <w:proofErr w:type="spellStart"/>
                                     <w:r>
                                       <w:rPr>
                                         <w:color w:val="595959" w:themeColor="text1" w:themeTint="A6"/>
@@ -754,6 +757,7 @@
                                       </w:rPr>
                                       <w:t>PyInstaller</w:t>
                                     </w:r>
+                                    <w:proofErr w:type="spellEnd"/>
                                   </w:p>
                                 </w:sdtContent>
                               </w:sdt>
@@ -881,6 +885,7 @@
                                 </w:rPr>
                                 <w:br/>
                               </w:r>
+                              <w:proofErr w:type="spellStart"/>
                               <w:r>
                                 <w:rPr>
                                   <w:color w:val="595959" w:themeColor="text1" w:themeTint="A6"/>
@@ -889,6 +894,7 @@
                                 </w:rPr>
                                 <w:t>OpenPyXL</w:t>
                               </w:r>
+                              <w:proofErr w:type="spellEnd"/>
                               <w:r>
                                 <w:rPr>
                                   <w:color w:val="595959" w:themeColor="text1" w:themeTint="A6"/>
@@ -945,6 +951,7 @@
                                 </w:rPr>
                                 <w:br/>
                               </w:r>
+                              <w:proofErr w:type="spellStart"/>
                               <w:r>
                                 <w:rPr>
                                   <w:color w:val="595959" w:themeColor="text1" w:themeTint="A6"/>
@@ -953,6 +960,7 @@
                                 </w:rPr>
                                 <w:t>PyInstaller</w:t>
                               </w:r>
+                              <w:proofErr w:type="spellEnd"/>
                             </w:p>
                           </w:sdtContent>
                         </w:sdt>
@@ -1505,8 +1513,17 @@
           <w:b/>
           <w:bCs/>
         </w:rPr>
-        <w:t>Cài đặt Github</w:t>
+        <w:t xml:space="preserve">Cài đặt </w:t>
       </w:r>
+      <w:proofErr w:type="spellStart"/>
+      <w:r>
+        <w:rPr>
+          <w:b/>
+          <w:bCs/>
+        </w:rPr>
+        <w:t>Github</w:t>
+      </w:r>
+      <w:proofErr w:type="spellEnd"/>
       <w:r>
         <w:rPr>
           <w:b/>
@@ -1634,6 +1651,7 @@
             <w:pPr>
               <w:pStyle w:val="NoSpacing"/>
             </w:pPr>
+            <w:proofErr w:type="gramStart"/>
             <w:r>
               <w:t>c</w:t>
             </w:r>
@@ -1643,6 +1661,7 @@
             <w:r>
               <w:t>D:\GitHub\DistanceCalculatorPro</w:t>
             </w:r>
+            <w:proofErr w:type="gramEnd"/>
           </w:p>
           <w:p>
             <w:pPr>
@@ -1716,24 +1735,31 @@
             <w:pPr>
               <w:pStyle w:val="NoSpacing"/>
             </w:pPr>
+            <w:proofErr w:type="gramStart"/>
             <w:r>
               <w:t xml:space="preserve">cd </w:t>
             </w:r>
             <w:r>
               <w:t>D:\GitHub\DistanceCalculatorPro</w:t>
             </w:r>
-          </w:p>
-          <w:p>
-            <w:pPr>
-              <w:pStyle w:val="NoSpacing"/>
-            </w:pPr>
-          </w:p>
-          <w:p>
-            <w:pPr>
-              <w:pStyle w:val="NoSpacing"/>
-            </w:pPr>
-            <w:r>
-              <w:t>playwright install chromium</w:t>
+            <w:proofErr w:type="gramEnd"/>
+          </w:p>
+          <w:p>
+            <w:pPr>
+              <w:pStyle w:val="NoSpacing"/>
+            </w:pPr>
+          </w:p>
+          <w:p>
+            <w:pPr>
+              <w:pStyle w:val="NoSpacing"/>
+            </w:pPr>
+            <w:proofErr w:type="gramStart"/>
+            <w:r>
+              <w:t>playwright</w:t>
+            </w:r>
+            <w:proofErr w:type="gramEnd"/>
+            <w:r>
+              <w:t xml:space="preserve"> install chromium</w:t>
             </w:r>
           </w:p>
         </w:tc>
@@ -1823,25 +1849,42 @@
             <w:pPr>
               <w:pStyle w:val="NoSpacing"/>
             </w:pPr>
+            <w:proofErr w:type="gramStart"/>
             <w:r>
               <w:t xml:space="preserve">cd </w:t>
             </w:r>
             <w:r>
               <w:t>D:\GitHub\DistanceCalculatorPro</w:t>
             </w:r>
-          </w:p>
-          <w:p>
-            <w:pPr>
-              <w:pStyle w:val="NoSpacing"/>
-            </w:pPr>
-          </w:p>
-          <w:p>
-            <w:pPr>
-              <w:pStyle w:val="NoSpacing"/>
-            </w:pPr>
-            <w:r>
-              <w:t>python -m venv .venv</w:t>
-            </w:r>
+            <w:proofErr w:type="gramEnd"/>
+          </w:p>
+          <w:p>
+            <w:pPr>
+              <w:pStyle w:val="NoSpacing"/>
+            </w:pPr>
+          </w:p>
+          <w:p>
+            <w:pPr>
+              <w:pStyle w:val="NoSpacing"/>
+            </w:pPr>
+            <w:r>
+              <w:t xml:space="preserve">python -m </w:t>
+            </w:r>
+            <w:proofErr w:type="spellStart"/>
+            <w:proofErr w:type="gramStart"/>
+            <w:r>
+              <w:t>venv</w:t>
+            </w:r>
+            <w:proofErr w:type="spellEnd"/>
+            <w:r>
+              <w:t xml:space="preserve"> .</w:t>
+            </w:r>
+            <w:proofErr w:type="spellStart"/>
+            <w:r>
+              <w:t>venv</w:t>
+            </w:r>
+            <w:proofErr w:type="spellEnd"/>
+            <w:proofErr w:type="gramEnd"/>
           </w:p>
         </w:tc>
       </w:tr>
@@ -1862,9 +1905,11 @@
             <w:pPr>
               <w:pStyle w:val="NoSpacing"/>
             </w:pPr>
+            <w:proofErr w:type="spellStart"/>
             <w:r>
               <w:t>DistanceCalculatorPro</w:t>
             </w:r>
+            <w:proofErr w:type="spellEnd"/>
           </w:p>
           <w:p>
             <w:pPr>
@@ -1882,11 +1927,24 @@
               <w:rPr>
                 <w:rFonts w:ascii="MS Gothic" w:eastAsia="MS Gothic" w:hAnsi="MS Gothic" w:cs="MS Gothic"/>
               </w:rPr>
-              <w:t>|--</w:t>
-            </w:r>
-            <w:r>
-              <w:t xml:space="preserve"> .venv</w:t>
-            </w:r>
+              <w:t>|</w:t>
+            </w:r>
+            <w:proofErr w:type="gramStart"/>
+            <w:r>
+              <w:rPr>
+                <w:rFonts w:ascii="MS Gothic" w:eastAsia="MS Gothic" w:hAnsi="MS Gothic" w:cs="MS Gothic"/>
+              </w:rPr>
+              <w:t>--</w:t>
+            </w:r>
+            <w:r>
+              <w:t xml:space="preserve"> .</w:t>
+            </w:r>
+            <w:proofErr w:type="spellStart"/>
+            <w:r>
+              <w:t>venv</w:t>
+            </w:r>
+            <w:proofErr w:type="spellEnd"/>
+            <w:proofErr w:type="gramEnd"/>
           </w:p>
           <w:p>
             <w:pPr>
@@ -1990,8 +2048,18 @@
             <w:pPr>
               <w:pStyle w:val="NoSpacing"/>
             </w:pPr>
-            <w:r>
-              <w:t>.venv\Scripts\activate</w:t>
+            <w:proofErr w:type="gramStart"/>
+            <w:r>
+              <w:t>.</w:t>
+            </w:r>
+            <w:proofErr w:type="spellStart"/>
+            <w:r>
+              <w:t>venv</w:t>
+            </w:r>
+            <w:proofErr w:type="spellEnd"/>
+            <w:proofErr w:type="gramEnd"/>
+            <w:r>
+              <w:t>\Scripts\activate</w:t>
             </w:r>
           </w:p>
           <w:p>
@@ -2019,7 +2087,15 @@
               <w:pStyle w:val="NoSpacing"/>
             </w:pPr>
             <w:r>
-              <w:t>(.venv) D:\GitHub\DistanceCalculatorPro&gt;.git</w:t>
+              <w:t>(.</w:t>
+            </w:r>
+            <w:proofErr w:type="spellStart"/>
+            <w:r>
+              <w:t>venv</w:t>
+            </w:r>
+            <w:proofErr w:type="spellEnd"/>
+            <w:r>
+              <w:t>) D:\GitHub\DistanceCalculatorPro&gt;.git</w:t>
             </w:r>
           </w:p>
         </w:tc>
@@ -2087,21 +2163,33 @@
             <w:pPr>
               <w:pStyle w:val="NoSpacing"/>
             </w:pPr>
+            <w:proofErr w:type="gramStart"/>
             <w:r>
               <w:t>cd D:\GitHub\DistanceCalculatorPro</w:t>
             </w:r>
-          </w:p>
-          <w:p>
-            <w:pPr>
-              <w:pStyle w:val="NoSpacing"/>
-            </w:pPr>
-          </w:p>
-          <w:p>
-            <w:pPr>
-              <w:pStyle w:val="NoSpacing"/>
-            </w:pPr>
-            <w:r>
-              <w:t>.venv\Scripts\activate</w:t>
+            <w:proofErr w:type="gramEnd"/>
+          </w:p>
+          <w:p>
+            <w:pPr>
+              <w:pStyle w:val="NoSpacing"/>
+            </w:pPr>
+          </w:p>
+          <w:p>
+            <w:pPr>
+              <w:pStyle w:val="NoSpacing"/>
+            </w:pPr>
+            <w:proofErr w:type="gramStart"/>
+            <w:r>
+              <w:t>.</w:t>
+            </w:r>
+            <w:proofErr w:type="spellStart"/>
+            <w:r>
+              <w:t>venv</w:t>
+            </w:r>
+            <w:proofErr w:type="spellEnd"/>
+            <w:proofErr w:type="gramEnd"/>
+            <w:r>
+              <w:t>\Scripts\activate</w:t>
             </w:r>
           </w:p>
           <w:p>
@@ -2140,6 +2228,562 @@
       <w:r>
         <w:t>05</w:t>
       </w:r>
+    </w:p>
+    <w:p>
+      <w:pPr>
+        <w:pStyle w:val="NoSpacing"/>
+      </w:pPr>
+    </w:p>
+    <w:p>
+      <w:pPr>
+        <w:pStyle w:val="NoSpacing"/>
+      </w:pPr>
+    </w:p>
+    <w:p>
+      <w:pPr>
+        <w:pStyle w:val="NoSpacing"/>
+        <w:rPr>
+          <w:b/>
+          <w:bCs/>
+        </w:rPr>
+      </w:pPr>
+      <w:r>
+        <w:rPr>
+          <w:b/>
+          <w:bCs/>
+        </w:rPr>
+        <w:t>SỬ DỤNG VISUAL STUDIO CODE</w:t>
+      </w:r>
+    </w:p>
+    <w:p>
+      <w:pPr>
+        <w:pStyle w:val="NoSpacing"/>
+      </w:pPr>
+    </w:p>
+    <w:p>
+      <w:pPr>
+        <w:pStyle w:val="NoSpacing"/>
+        <w:numPr>
+          <w:ilvl w:val="0"/>
+          <w:numId w:val="11"/>
+        </w:numPr>
+        <w:rPr>
+          <w:b/>
+          <w:bCs/>
+        </w:rPr>
+      </w:pPr>
+      <w:r>
+        <w:rPr>
+          <w:b/>
+          <w:bCs/>
+        </w:rPr>
+        <w:t>Cài đặt Visual Studio Code</w:t>
+      </w:r>
+    </w:p>
+    <w:p>
+      <w:pPr>
+        <w:pStyle w:val="NoSpacing"/>
+        <w:ind w:left="1080"/>
+      </w:pPr>
+      <w:r>
+        <w:t xml:space="preserve">Link download: </w:t>
+      </w:r>
+      <w:r>
+        <w:t>https://code.visualstudio.com/download</w:t>
+      </w:r>
+    </w:p>
+    <w:p>
+      <w:pPr>
+        <w:pStyle w:val="NoSpacing"/>
+      </w:pPr>
+    </w:p>
+    <w:p>
+      <w:pPr>
+        <w:pStyle w:val="NoSpacing"/>
+        <w:numPr>
+          <w:ilvl w:val="0"/>
+          <w:numId w:val="11"/>
+        </w:numPr>
+        <w:rPr>
+          <w:b/>
+          <w:bCs/>
+        </w:rPr>
+      </w:pPr>
+      <w:r>
+        <w:rPr>
+          <w:b/>
+          <w:bCs/>
+        </w:rPr>
+        <w:t xml:space="preserve">Cài đặt Git </w:t>
+      </w:r>
+      <w:proofErr w:type="gramStart"/>
+      <w:r>
+        <w:rPr>
+          <w:b/>
+          <w:bCs/>
+        </w:rPr>
+        <w:t>For</w:t>
+      </w:r>
+      <w:proofErr w:type="gramEnd"/>
+      <w:r>
+        <w:rPr>
+          <w:b/>
+          <w:bCs/>
+        </w:rPr>
+        <w:t xml:space="preserve"> Windows</w:t>
+      </w:r>
+    </w:p>
+    <w:p>
+      <w:pPr>
+        <w:pStyle w:val="NoSpacing"/>
+        <w:ind w:left="1080"/>
+      </w:pPr>
+      <w:r>
+        <w:t xml:space="preserve">Link download: </w:t>
+      </w:r>
+      <w:r>
+        <w:t>https://git-scm.com/install/windows?utm_source=chatgpt.com</w:t>
+      </w:r>
+    </w:p>
+    <w:p>
+      <w:pPr>
+        <w:pStyle w:val="NoSpacing"/>
+      </w:pPr>
+    </w:p>
+    <w:p>
+      <w:pPr>
+        <w:pStyle w:val="NoSpacing"/>
+        <w:numPr>
+          <w:ilvl w:val="0"/>
+          <w:numId w:val="11"/>
+        </w:numPr>
+        <w:rPr>
+          <w:b/>
+          <w:bCs/>
+        </w:rPr>
+      </w:pPr>
+      <w:r>
+        <w:rPr>
+          <w:b/>
+          <w:bCs/>
+        </w:rPr>
+        <w:t xml:space="preserve">Cấu hình Git </w:t>
+      </w:r>
+      <w:proofErr w:type="gramStart"/>
+      <w:r>
+        <w:rPr>
+          <w:b/>
+          <w:bCs/>
+        </w:rPr>
+        <w:t>For</w:t>
+      </w:r>
+      <w:proofErr w:type="gramEnd"/>
+      <w:r>
+        <w:rPr>
+          <w:b/>
+          <w:bCs/>
+        </w:rPr>
+        <w:t xml:space="preserve"> Windows (làm 1 lần)</w:t>
+      </w:r>
+    </w:p>
+    <w:p>
+      <w:pPr>
+        <w:pStyle w:val="NoSpacing"/>
+      </w:pPr>
+    </w:p>
+    <w:tbl>
+      <w:tblPr>
+        <w:tblStyle w:val="TableGrid"/>
+        <w:tblW w:w="0" w:type="auto"/>
+        <w:tblInd w:w="1080" w:type="dxa"/>
+        <w:tblLook w:val="04A0" w:firstRow="1" w:lastRow="0" w:firstColumn="1" w:lastColumn="0" w:noHBand="0" w:noVBand="1"/>
+      </w:tblPr>
+      <w:tblGrid>
+        <w:gridCol w:w="9376"/>
+      </w:tblGrid>
+      <w:tr>
+        <w:tc>
+          <w:tcPr>
+            <w:tcW w:w="10456" w:type="dxa"/>
+          </w:tcPr>
+          <w:p>
+            <w:pPr>
+              <w:pStyle w:val="NoSpacing"/>
+            </w:pPr>
+            <w:r>
+              <w:t>git config --global user.name "</w:t>
+            </w:r>
+            <w:r>
+              <w:t xml:space="preserve"> </w:t>
+            </w:r>
+            <w:proofErr w:type="spellStart"/>
+            <w:r>
+              <w:t>user</w:t>
+            </w:r>
+            <w:r>
+              <w:t>_github_của_bạn</w:t>
+            </w:r>
+            <w:proofErr w:type="spellEnd"/>
+            <w:r>
+              <w:t>"</w:t>
+            </w:r>
+          </w:p>
+          <w:p>
+            <w:pPr>
+              <w:pStyle w:val="NoSpacing"/>
+            </w:pPr>
+            <w:r>
+              <w:t xml:space="preserve">git config --global </w:t>
+            </w:r>
+            <w:proofErr w:type="spellStart"/>
+            <w:proofErr w:type="gramStart"/>
+            <w:r>
+              <w:t>user.email</w:t>
+            </w:r>
+            <w:proofErr w:type="spellEnd"/>
+            <w:proofErr w:type="gramEnd"/>
+            <w:r>
+              <w:t xml:space="preserve"> "email_github_của_bạn@example.com"</w:t>
+            </w:r>
+          </w:p>
+          <w:p>
+            <w:pPr>
+              <w:pStyle w:val="NoSpacing"/>
+            </w:pPr>
+            <w:r>
+              <w:t xml:space="preserve">git config --global </w:t>
+            </w:r>
+            <w:r>
+              <w:t>–</w:t>
+            </w:r>
+            <w:r>
+              <w:t>list</w:t>
+            </w:r>
+          </w:p>
+          <w:p>
+            <w:pPr>
+              <w:pStyle w:val="NoSpacing"/>
+            </w:pPr>
+          </w:p>
+        </w:tc>
+      </w:tr>
+      <w:tr>
+        <w:tc>
+          <w:tcPr>
+            <w:tcW w:w="10456" w:type="dxa"/>
+          </w:tcPr>
+          <w:p>
+            <w:pPr>
+              <w:pStyle w:val="NoSpacing"/>
+            </w:pPr>
+            <w:r>
+              <w:t>Kết quả:</w:t>
+            </w:r>
+          </w:p>
+          <w:p>
+            <w:pPr>
+              <w:pStyle w:val="NoSpacing"/>
+            </w:pPr>
+            <w:r>
+              <w:t>(.</w:t>
+            </w:r>
+            <w:proofErr w:type="spellStart"/>
+            <w:r>
+              <w:t>venv</w:t>
+            </w:r>
+            <w:proofErr w:type="spellEnd"/>
+            <w:r>
+              <w:t xml:space="preserve">) PS D:\GitHub\DistanceCalculatorPro&gt; git config --global </w:t>
+            </w:r>
+            <w:proofErr w:type="spellStart"/>
+            <w:proofErr w:type="gramStart"/>
+            <w:r>
+              <w:t>user.email</w:t>
+            </w:r>
+            <w:proofErr w:type="spellEnd"/>
+            <w:proofErr w:type="gramEnd"/>
+            <w:r>
+              <w:t xml:space="preserve"> "</w:t>
+            </w:r>
+            <w:r>
+              <w:t xml:space="preserve"> </w:t>
+            </w:r>
+            <w:r>
+              <w:t xml:space="preserve">kalius25@gmail.com"         </w:t>
+            </w:r>
+          </w:p>
+          <w:p>
+            <w:pPr>
+              <w:pStyle w:val="NoSpacing"/>
+            </w:pPr>
+            <w:r>
+              <w:t>(.</w:t>
+            </w:r>
+            <w:proofErr w:type="spellStart"/>
+            <w:r>
+              <w:t>venv</w:t>
+            </w:r>
+            <w:proofErr w:type="spellEnd"/>
+            <w:r>
+              <w:t xml:space="preserve">) PS D:\GitHub\DistanceCalculatorPro&gt; git config --global user.name "kalius25"                </w:t>
+            </w:r>
+          </w:p>
+          <w:p>
+            <w:pPr>
+              <w:pStyle w:val="NoSpacing"/>
+            </w:pPr>
+            <w:r>
+              <w:t>(.</w:t>
+            </w:r>
+            <w:proofErr w:type="spellStart"/>
+            <w:r>
+              <w:t>venv</w:t>
+            </w:r>
+            <w:proofErr w:type="spellEnd"/>
+            <w:r>
+              <w:t xml:space="preserve">) PS D:\GitHub\DistanceCalculatorPro&gt; git config --global --list              </w:t>
+            </w:r>
+          </w:p>
+          <w:p>
+            <w:pPr>
+              <w:pStyle w:val="NoSpacing"/>
+            </w:pPr>
+            <w:proofErr w:type="spellStart"/>
+            <w:proofErr w:type="gramStart"/>
+            <w:r>
+              <w:t>filter.lfs.process</w:t>
+            </w:r>
+            <w:proofErr w:type="spellEnd"/>
+            <w:proofErr w:type="gramEnd"/>
+            <w:r>
+              <w:t>=git-</w:t>
+            </w:r>
+            <w:proofErr w:type="spellStart"/>
+            <w:r>
+              <w:t>lfs</w:t>
+            </w:r>
+            <w:proofErr w:type="spellEnd"/>
+            <w:r>
+              <w:t xml:space="preserve"> filter-process</w:t>
+            </w:r>
+          </w:p>
+          <w:p>
+            <w:pPr>
+              <w:pStyle w:val="NoSpacing"/>
+            </w:pPr>
+            <w:proofErr w:type="spellStart"/>
+            <w:proofErr w:type="gramStart"/>
+            <w:r>
+              <w:t>filter.lfs.required</w:t>
+            </w:r>
+            <w:proofErr w:type="spellEnd"/>
+            <w:proofErr w:type="gramEnd"/>
+            <w:r>
+              <w:t>=true</w:t>
+            </w:r>
+          </w:p>
+          <w:p>
+            <w:pPr>
+              <w:pStyle w:val="NoSpacing"/>
+            </w:pPr>
+            <w:proofErr w:type="spellStart"/>
+            <w:proofErr w:type="gramStart"/>
+            <w:r>
+              <w:t>filter.lfs.clean</w:t>
+            </w:r>
+            <w:proofErr w:type="spellEnd"/>
+            <w:proofErr w:type="gramEnd"/>
+            <w:r>
+              <w:t>=git-</w:t>
+            </w:r>
+            <w:proofErr w:type="spellStart"/>
+            <w:r>
+              <w:t>lfs</w:t>
+            </w:r>
+            <w:proofErr w:type="spellEnd"/>
+            <w:r>
+              <w:t xml:space="preserve"> clean -- %f</w:t>
+            </w:r>
+          </w:p>
+          <w:p>
+            <w:pPr>
+              <w:pStyle w:val="NoSpacing"/>
+            </w:pPr>
+            <w:proofErr w:type="spellStart"/>
+            <w:proofErr w:type="gramStart"/>
+            <w:r>
+              <w:t>filter.lfs.smudge</w:t>
+            </w:r>
+            <w:proofErr w:type="spellEnd"/>
+            <w:proofErr w:type="gramEnd"/>
+            <w:r>
+              <w:t>=git-</w:t>
+            </w:r>
+            <w:proofErr w:type="spellStart"/>
+            <w:r>
+              <w:t>lfs</w:t>
+            </w:r>
+            <w:proofErr w:type="spellEnd"/>
+            <w:r>
+              <w:t xml:space="preserve"> smudge -- %f</w:t>
+            </w:r>
+          </w:p>
+          <w:p>
+            <w:pPr>
+              <w:pStyle w:val="NoSpacing"/>
+            </w:pPr>
+            <w:r>
+              <w:t>user.name=kalius25</w:t>
+            </w:r>
+          </w:p>
+          <w:p>
+            <w:pPr>
+              <w:pStyle w:val="NoSpacing"/>
+            </w:pPr>
+            <w:proofErr w:type="spellStart"/>
+            <w:proofErr w:type="gramStart"/>
+            <w:r>
+              <w:t>user.email</w:t>
+            </w:r>
+            <w:proofErr w:type="spellEnd"/>
+            <w:proofErr w:type="gramEnd"/>
+            <w:r>
+              <w:t>=</w:t>
+            </w:r>
+            <w:r>
+              <w:t xml:space="preserve"> </w:t>
+            </w:r>
+            <w:r>
+              <w:t>kalius25@gmail.com</w:t>
+            </w:r>
+          </w:p>
+        </w:tc>
+      </w:tr>
+    </w:tbl>
+    <w:p>
+      <w:pPr>
+        <w:pStyle w:val="NoSpacing"/>
+        <w:rPr>
+          <w:b/>
+          <w:bCs/>
+        </w:rPr>
+      </w:pPr>
+    </w:p>
+    <w:p>
+      <w:pPr>
+        <w:pStyle w:val="NoSpacing"/>
+        <w:numPr>
+          <w:ilvl w:val="0"/>
+          <w:numId w:val="11"/>
+        </w:numPr>
+        <w:rPr>
+          <w:b/>
+          <w:bCs/>
+        </w:rPr>
+      </w:pPr>
+      <w:r>
+        <w:rPr>
+          <w:b/>
+          <w:bCs/>
+        </w:rPr>
+        <w:t xml:space="preserve">Kiểm tra kết nối tới </w:t>
+      </w:r>
+      <w:proofErr w:type="spellStart"/>
+      <w:r>
+        <w:rPr>
+          <w:b/>
+          <w:bCs/>
+        </w:rPr>
+        <w:t>Github</w:t>
+      </w:r>
+      <w:proofErr w:type="spellEnd"/>
+    </w:p>
+    <w:p>
+      <w:pPr>
+        <w:pStyle w:val="NoSpacing"/>
+      </w:pPr>
+    </w:p>
+    <w:tbl>
+      <w:tblPr>
+        <w:tblStyle w:val="TableGrid"/>
+        <w:tblW w:w="0" w:type="auto"/>
+        <w:tblInd w:w="1080" w:type="dxa"/>
+        <w:tblLook w:val="04A0" w:firstRow="1" w:lastRow="0" w:firstColumn="1" w:lastColumn="0" w:noHBand="0" w:noVBand="1"/>
+      </w:tblPr>
+      <w:tblGrid>
+        <w:gridCol w:w="9376"/>
+      </w:tblGrid>
+      <w:tr>
+        <w:tc>
+          <w:tcPr>
+            <w:tcW w:w="10456" w:type="dxa"/>
+          </w:tcPr>
+          <w:p>
+            <w:pPr>
+              <w:pStyle w:val="NoSpacing"/>
+            </w:pPr>
+            <w:r>
+              <w:t xml:space="preserve">git </w:t>
+            </w:r>
+            <w:proofErr w:type="gramStart"/>
+            <w:r>
+              <w:t>remote -v</w:t>
+            </w:r>
+            <w:proofErr w:type="gramEnd"/>
+          </w:p>
+          <w:p>
+            <w:pPr>
+              <w:pStyle w:val="NoSpacing"/>
+            </w:pPr>
+          </w:p>
+        </w:tc>
+      </w:tr>
+      <w:tr>
+        <w:tc>
+          <w:tcPr>
+            <w:tcW w:w="10456" w:type="dxa"/>
+          </w:tcPr>
+          <w:p>
+            <w:pPr>
+              <w:pStyle w:val="NoSpacing"/>
+            </w:pPr>
+            <w:r>
+              <w:t>Kết quả:</w:t>
+            </w:r>
+          </w:p>
+          <w:p>
+            <w:pPr>
+              <w:pStyle w:val="NoSpacing"/>
+            </w:pPr>
+            <w:proofErr w:type="gramStart"/>
+            <w:r>
+              <w:t>origin  https://github.com/kalius25/DistanceCalculatorPro.git</w:t>
+            </w:r>
+            <w:proofErr w:type="gramEnd"/>
+            <w:r>
+              <w:t xml:space="preserve"> (fetch)</w:t>
+            </w:r>
+          </w:p>
+          <w:p>
+            <w:pPr>
+              <w:pStyle w:val="NoSpacing"/>
+            </w:pPr>
+            <w:proofErr w:type="gramStart"/>
+            <w:r>
+              <w:t>origin  https://github.com/kalius25/DistanceCalculatorPro.git</w:t>
+            </w:r>
+            <w:proofErr w:type="gramEnd"/>
+            <w:r>
+              <w:t xml:space="preserve"> (push)</w:t>
+            </w:r>
+          </w:p>
+        </w:tc>
+      </w:tr>
+    </w:tbl>
+    <w:p>
+      <w:pPr>
+        <w:pStyle w:val="NoSpacing"/>
+      </w:pPr>
     </w:p>
     <w:sectPr>
       <w:pgSz w:w="11906" w:h="16838" w:code="9"/>
@@ -2423,6 +3067,95 @@
     </w:lvl>
   </w:abstractNum>
   <w:abstractNum w:abstractNumId="3" w15:restartNumberingAfterBreak="0">
+    <w:nsid w:val="1D4A58AB"/>
+    <w:multiLevelType w:val="hybridMultilevel"/>
+    <w:tmpl w:val="734EF8E8"/>
+    <w:lvl w:ilvl="0" w:tplc="FFFFFFFF">
+      <w:start w:val="1"/>
+      <w:numFmt w:val="decimal"/>
+      <w:lvlText w:val="%1."/>
+      <w:lvlJc w:val="left"/>
+      <w:pPr>
+        <w:ind w:left="1080" w:hanging="360"/>
+      </w:pPr>
+      <w:rPr>
+        <w:rFonts w:hint="default"/>
+      </w:rPr>
+    </w:lvl>
+    <w:lvl w:ilvl="1" w:tplc="FFFFFFFF">
+      <w:start w:val="1"/>
+      <w:numFmt w:val="lowerLetter"/>
+      <w:lvlText w:val="%2."/>
+      <w:lvlJc w:val="left"/>
+      <w:pPr>
+        <w:ind w:left="1800" w:hanging="360"/>
+      </w:pPr>
+    </w:lvl>
+    <w:lvl w:ilvl="2" w:tplc="FFFFFFFF" w:tentative="1">
+      <w:start w:val="1"/>
+      <w:numFmt w:val="lowerRoman"/>
+      <w:lvlText w:val="%3."/>
+      <w:lvlJc w:val="right"/>
+      <w:pPr>
+        <w:ind w:left="2520" w:hanging="180"/>
+      </w:pPr>
+    </w:lvl>
+    <w:lvl w:ilvl="3" w:tplc="FFFFFFFF" w:tentative="1">
+      <w:start w:val="1"/>
+      <w:numFmt w:val="decimal"/>
+      <w:lvlText w:val="%4."/>
+      <w:lvlJc w:val="left"/>
+      <w:pPr>
+        <w:ind w:left="3240" w:hanging="360"/>
+      </w:pPr>
+    </w:lvl>
+    <w:lvl w:ilvl="4" w:tplc="FFFFFFFF" w:tentative="1">
+      <w:start w:val="1"/>
+      <w:numFmt w:val="lowerLetter"/>
+      <w:lvlText w:val="%5."/>
+      <w:lvlJc w:val="left"/>
+      <w:pPr>
+        <w:ind w:left="3960" w:hanging="360"/>
+      </w:pPr>
+    </w:lvl>
+    <w:lvl w:ilvl="5" w:tplc="FFFFFFFF" w:tentative="1">
+      <w:start w:val="1"/>
+      <w:numFmt w:val="lowerRoman"/>
+      <w:lvlText w:val="%6."/>
+      <w:lvlJc w:val="right"/>
+      <w:pPr>
+        <w:ind w:left="4680" w:hanging="180"/>
+      </w:pPr>
+    </w:lvl>
+    <w:lvl w:ilvl="6" w:tplc="FFFFFFFF" w:tentative="1">
+      <w:start w:val="1"/>
+      <w:numFmt w:val="decimal"/>
+      <w:lvlText w:val="%7."/>
+      <w:lvlJc w:val="left"/>
+      <w:pPr>
+        <w:ind w:left="5400" w:hanging="360"/>
+      </w:pPr>
+    </w:lvl>
+    <w:lvl w:ilvl="7" w:tplc="FFFFFFFF" w:tentative="1">
+      <w:start w:val="1"/>
+      <w:numFmt w:val="lowerLetter"/>
+      <w:lvlText w:val="%8."/>
+      <w:lvlJc w:val="left"/>
+      <w:pPr>
+        <w:ind w:left="6120" w:hanging="360"/>
+      </w:pPr>
+    </w:lvl>
+    <w:lvl w:ilvl="8" w:tplc="FFFFFFFF" w:tentative="1">
+      <w:start w:val="1"/>
+      <w:numFmt w:val="lowerRoman"/>
+      <w:lvlText w:val="%9."/>
+      <w:lvlJc w:val="right"/>
+      <w:pPr>
+        <w:ind w:left="6840" w:hanging="180"/>
+      </w:pPr>
+    </w:lvl>
+  </w:abstractNum>
+  <w:abstractNum w:abstractNumId="4" w15:restartNumberingAfterBreak="0">
     <w:nsid w:val="1EAE301F"/>
     <w:multiLevelType w:val="hybridMultilevel"/>
     <w:tmpl w:val="BA2E22E4"/>
@@ -2511,7 +3244,7 @@
       </w:pPr>
     </w:lvl>
   </w:abstractNum>
-  <w:abstractNum w:abstractNumId="4" w15:restartNumberingAfterBreak="0">
+  <w:abstractNum w:abstractNumId="5" w15:restartNumberingAfterBreak="0">
     <w:nsid w:val="1F332DAB"/>
     <w:multiLevelType w:val="hybridMultilevel"/>
     <w:tmpl w:val="9294DD36"/>
@@ -2600,7 +3333,7 @@
       </w:pPr>
     </w:lvl>
   </w:abstractNum>
-  <w:abstractNum w:abstractNumId="5" w15:restartNumberingAfterBreak="0">
+  <w:abstractNum w:abstractNumId="6" w15:restartNumberingAfterBreak="0">
     <w:nsid w:val="2B454387"/>
     <w:multiLevelType w:val="hybridMultilevel"/>
     <w:tmpl w:val="5F7EFD18"/>
@@ -2689,7 +3422,7 @@
       </w:pPr>
     </w:lvl>
   </w:abstractNum>
-  <w:abstractNum w:abstractNumId="6" w15:restartNumberingAfterBreak="0">
+  <w:abstractNum w:abstractNumId="7" w15:restartNumberingAfterBreak="0">
     <w:nsid w:val="2D8B7036"/>
     <w:multiLevelType w:val="hybridMultilevel"/>
     <w:tmpl w:val="6F9C1226"/>
@@ -2778,7 +3511,7 @@
       </w:pPr>
     </w:lvl>
   </w:abstractNum>
-  <w:abstractNum w:abstractNumId="7" w15:restartNumberingAfterBreak="0">
+  <w:abstractNum w:abstractNumId="8" w15:restartNumberingAfterBreak="0">
     <w:nsid w:val="3BC958CC"/>
     <w:multiLevelType w:val="hybridMultilevel"/>
     <w:tmpl w:val="49FE1DC4"/>
@@ -2867,7 +3600,7 @@
       </w:pPr>
     </w:lvl>
   </w:abstractNum>
-  <w:abstractNum w:abstractNumId="8" w15:restartNumberingAfterBreak="0">
+  <w:abstractNum w:abstractNumId="9" w15:restartNumberingAfterBreak="0">
     <w:nsid w:val="4C77455A"/>
     <w:multiLevelType w:val="hybridMultilevel"/>
     <w:tmpl w:val="6F9C1226"/>
@@ -2956,7 +3689,7 @@
       </w:pPr>
     </w:lvl>
   </w:abstractNum>
-  <w:abstractNum w:abstractNumId="9" w15:restartNumberingAfterBreak="0">
+  <w:abstractNum w:abstractNumId="10" w15:restartNumberingAfterBreak="0">
     <w:nsid w:val="5DF13042"/>
     <w:multiLevelType w:val="hybridMultilevel"/>
     <w:tmpl w:val="734EF8E8"/>
@@ -3045,23 +3778,112 @@
       </w:pPr>
     </w:lvl>
   </w:abstractNum>
+  <w:abstractNum w:abstractNumId="11" w15:restartNumberingAfterBreak="0">
+    <w:nsid w:val="69D4266B"/>
+    <w:multiLevelType w:val="hybridMultilevel"/>
+    <w:tmpl w:val="734EF8E8"/>
+    <w:lvl w:ilvl="0" w:tplc="FFFFFFFF">
+      <w:start w:val="1"/>
+      <w:numFmt w:val="decimal"/>
+      <w:lvlText w:val="%1."/>
+      <w:lvlJc w:val="left"/>
+      <w:pPr>
+        <w:ind w:left="1080" w:hanging="360"/>
+      </w:pPr>
+      <w:rPr>
+        <w:rFonts w:hint="default"/>
+      </w:rPr>
+    </w:lvl>
+    <w:lvl w:ilvl="1" w:tplc="FFFFFFFF">
+      <w:start w:val="1"/>
+      <w:numFmt w:val="lowerLetter"/>
+      <w:lvlText w:val="%2."/>
+      <w:lvlJc w:val="left"/>
+      <w:pPr>
+        <w:ind w:left="1800" w:hanging="360"/>
+      </w:pPr>
+    </w:lvl>
+    <w:lvl w:ilvl="2" w:tplc="FFFFFFFF" w:tentative="1">
+      <w:start w:val="1"/>
+      <w:numFmt w:val="lowerRoman"/>
+      <w:lvlText w:val="%3."/>
+      <w:lvlJc w:val="right"/>
+      <w:pPr>
+        <w:ind w:left="2520" w:hanging="180"/>
+      </w:pPr>
+    </w:lvl>
+    <w:lvl w:ilvl="3" w:tplc="FFFFFFFF" w:tentative="1">
+      <w:start w:val="1"/>
+      <w:numFmt w:val="decimal"/>
+      <w:lvlText w:val="%4."/>
+      <w:lvlJc w:val="left"/>
+      <w:pPr>
+        <w:ind w:left="3240" w:hanging="360"/>
+      </w:pPr>
+    </w:lvl>
+    <w:lvl w:ilvl="4" w:tplc="FFFFFFFF" w:tentative="1">
+      <w:start w:val="1"/>
+      <w:numFmt w:val="lowerLetter"/>
+      <w:lvlText w:val="%5."/>
+      <w:lvlJc w:val="left"/>
+      <w:pPr>
+        <w:ind w:left="3960" w:hanging="360"/>
+      </w:pPr>
+    </w:lvl>
+    <w:lvl w:ilvl="5" w:tplc="FFFFFFFF" w:tentative="1">
+      <w:start w:val="1"/>
+      <w:numFmt w:val="lowerRoman"/>
+      <w:lvlText w:val="%6."/>
+      <w:lvlJc w:val="right"/>
+      <w:pPr>
+        <w:ind w:left="4680" w:hanging="180"/>
+      </w:pPr>
+    </w:lvl>
+    <w:lvl w:ilvl="6" w:tplc="FFFFFFFF" w:tentative="1">
+      <w:start w:val="1"/>
+      <w:numFmt w:val="decimal"/>
+      <w:lvlText w:val="%7."/>
+      <w:lvlJc w:val="left"/>
+      <w:pPr>
+        <w:ind w:left="5400" w:hanging="360"/>
+      </w:pPr>
+    </w:lvl>
+    <w:lvl w:ilvl="7" w:tplc="FFFFFFFF" w:tentative="1">
+      <w:start w:val="1"/>
+      <w:numFmt w:val="lowerLetter"/>
+      <w:lvlText w:val="%8."/>
+      <w:lvlJc w:val="left"/>
+      <w:pPr>
+        <w:ind w:left="6120" w:hanging="360"/>
+      </w:pPr>
+    </w:lvl>
+    <w:lvl w:ilvl="8" w:tplc="FFFFFFFF" w:tentative="1">
+      <w:start w:val="1"/>
+      <w:numFmt w:val="lowerRoman"/>
+      <w:lvlText w:val="%9."/>
+      <w:lvlJc w:val="right"/>
+      <w:pPr>
+        <w:ind w:left="6840" w:hanging="180"/>
+      </w:pPr>
+    </w:lvl>
+  </w:abstractNum>
   <w:num w:numId="1" w16cid:durableId="1417171492">
-    <w:abstractNumId w:val="3"/>
+    <w:abstractNumId w:val="4"/>
   </w:num>
   <w:num w:numId="2" w16cid:durableId="982851886">
-    <w:abstractNumId w:val="7"/>
+    <w:abstractNumId w:val="8"/>
   </w:num>
   <w:num w:numId="3" w16cid:durableId="2130396533">
-    <w:abstractNumId w:val="5"/>
+    <w:abstractNumId w:val="6"/>
   </w:num>
   <w:num w:numId="4" w16cid:durableId="36782991">
     <w:abstractNumId w:val="1"/>
   </w:num>
   <w:num w:numId="5" w16cid:durableId="1994409286">
-    <w:abstractNumId w:val="4"/>
+    <w:abstractNumId w:val="5"/>
   </w:num>
   <w:num w:numId="6" w16cid:durableId="1027559433">
-    <w:abstractNumId w:val="9"/>
+    <w:abstractNumId w:val="10"/>
   </w:num>
   <w:num w:numId="7" w16cid:durableId="1730955895">
     <w:abstractNumId w:val="2"/>
@@ -3070,10 +3892,16 @@
     <w:abstractNumId w:val="0"/>
   </w:num>
   <w:num w:numId="9" w16cid:durableId="1180973476">
-    <w:abstractNumId w:val="8"/>
+    <w:abstractNumId w:val="9"/>
   </w:num>
   <w:num w:numId="10" w16cid:durableId="598561855">
-    <w:abstractNumId w:val="6"/>
+    <w:abstractNumId w:val="7"/>
+  </w:num>
+  <w:num w:numId="11" w16cid:durableId="1396659508">
+    <w:abstractNumId w:val="3"/>
+  </w:num>
+  <w:num w:numId="12" w16cid:durableId="97793934">
+    <w:abstractNumId w:val="11"/>
   </w:num>
 </w:numbering>
 </file>
@@ -3478,7 +4306,7 @@
   <w:style w:type="paragraph" w:default="1" w:styleId="Normal">
     <w:name w:val="Normal"/>
     <w:qFormat/>
-    <w:rsid w:val="00D445F2"/>
+    <w:rsid w:val="002428A9"/>
   </w:style>
   <w:style w:type="paragraph" w:styleId="Heading1">
     <w:name w:val="heading 1"/>

</xml_diff>